<commit_message>
Add SaaSpocalypse beat and Why-now section to FDD pitch deck
- Market section: new closing block on per-seat collapse and ownership posture.
- New Why-now section before the closer: cheap-build window framed against
  OpenAI 2025 losses and Alphabet 2026 capex step-up.
- Nav: added Why-now link.
- Asset refresh: Forward-Deployed-Decade.docx now mirrors the whitepaper's
  added 3.5 (per-seat licensing supply side), 8.6 (token-pricing risk),
  9 (clock on the input side), and new bibliography entries.

Co-Authored-By: Claude Opus 4.7 <noreply@anthropic.com>
</commit_message>
<xml_diff>
--- a/forward-deployed-decade/assets/Forward-Deployed-Decade.docx
+++ b/forward-deployed-decade/assets/Forward-Deployed-Decade.docx
@@ -759,6 +759,69 @@
         </w:rPr>
         <w:lastRenderedPageBreak/>
         <w:t>wrenches. The bottom of the market does not have less opportunity. It has different opportunity, and the firms above it are economically incapable of reaching for it.</w:t>
+      </w:r>
+    </w:p>
+    <w:p>
+      <w:pPr>
+        <w:pStyle w:val="Heading2"/>
+        <w:spacing w:before="240" w:after="80"/>
+      </w:pPr>
+      <w:r>
+        <w:rPr>
+          <w:rFonts w:ascii="Poppins" w:hAnsi="Poppins"/>
+          <w:color w:val="1E1D1C"/>
+        </w:rPr>
+        <w:t>3.5 Per-seat licensing is breaking on the supply side.</w:t>
+      </w:r>
+    </w:p>
+    <w:p>
+      <w:pPr>
+        <w:spacing w:after="120"/>
+      </w:pPr>
+      <w:r>
+        <w:rPr>
+          <w:color w:val="1E1D1C"/>
+        </w:rPr>
+        <w:t>The vendor side of the same gap is also breaking. Wall Street analysts coined the term SaaSpocalypse for the rolling 2026 selloff in enterprise software stocks, on the recognition that per-seat licensing does not survive AI agents that replace ten or fifty seated users at once.</w:t>
+      </w:r>
+      <w:r>
+        <w:rPr>
+          <w:color w:val="1E1D1C"/>
+          <w:vertAlign w:val="superscript"/>
+        </w:rPr>
+        <w:t>12</w:t>
+      </w:r>
+      <w:r>
+        <w:rPr>
+          <w:color w:val="1E1D1C"/>
+        </w:rPr>
+        <w:t xml:space="preserve"> </w:t>
+      </w:r>
+      <w:r>
+        <w:rPr>
+          <w:color w:val="1E1D1C"/>
+          <w:vertAlign w:val="superscript"/>
+        </w:rPr>
+        <w:t>13</w:t>
+      </w:r>
+      <w:r>
+        <w:rPr>
+          <w:color w:val="1E1D1C"/>
+        </w:rPr>
+        <w:t xml:space="preserve"> Bain reports that buyers across the mid-market are pushing back on overprovisioning, shadow IT sprawl, and stranded per-user credits that no longer track actual work patterns; vendors are responding with consumption pricing and outcome pricing, both of which still rent the tool.</w:t>
+      </w:r>
+      <w:r>
+        <w:rPr>
+          <w:color w:val="1E1D1C"/>
+          <w:vertAlign w:val="superscript"/>
+        </w:rPr>
+        <w:t>14</w:t>
+      </w:r>
+      <w:r>
+        <w:rPr>
+          <w:color w:val="1E1D1C"/>
+        </w:rPr>
+        <w:t xml:space="preserve"> The buyer who runs a $12 million trade shop is already past that bargain. Ownership of the working tool is what fits the way these firms actually buy: they own their trucks, they own their shop, they own their tooling, and they expect the same of software they pay to have built. The market opening already documented above is widening on its supply side at the same time.</w:t>
       </w:r>
     </w:p>
     <w:p>
@@ -2131,6 +2194,22 @@
               <w:t>Commoditization of basic implementation will compress consulting premiums on shallow work; the defense is depth and recurring relationships.</w:t>
             </w:r>
           </w:p>
+          <w:p>
+            <w:pPr>
+              <w:spacing w:after="60"/>
+              <w:ind w:left="173" w:hanging="173"/>
+              <w:rPr>
+                <w:rFonts w:hint="eastAsia"/>
+              </w:rPr>
+            </w:pPr>
+            <w:r>
+              <w:rPr>
+                <w:color w:val="1E1D1C"/>
+                <w:sz w:val="18"/>
+              </w:rPr>
+              <w:t>• Token pricing normalization: current inference costs are subsidized below the unit economics of the AI infrastructure buildout (OpenAI losses ran $5 to $13.5 billion against $3.7 to $4.3 billion of 2025 revenue; Alphabet capex steps from $75 billion in 2025 to $175 to $185 billion in 2026). Engagement pricing has to reserve headroom for the eventual reprice.</w:t>
+            </w:r>
+          </w:p>
         </w:tc>
       </w:tr>
     </w:tbl>
@@ -2306,6 +2385,56 @@
     </w:p>
     <w:p>
       <w:pPr>
+        <w:pStyle w:val="Heading2"/>
+        <w:spacing w:before="240" w:after="80"/>
+      </w:pPr>
+      <w:r>
+        <w:rPr>
+          <w:rFonts w:ascii="Poppins" w:hAnsi="Poppins"/>
+          <w:color w:val="1E1D1C"/>
+        </w:rPr>
+        <w:t>8.6 Token-pricing risk.</w:t>
+      </w:r>
+    </w:p>
+    <w:p>
+      <w:pPr>
+        <w:spacing w:after="120"/>
+      </w:pPr>
+      <w:r>
+        <w:rPr>
+          <w:color w:val="1E1D1C"/>
+        </w:rPr>
+        <w:t>Current AI inference costs sit below the unit economics of the buildout that produces them. Major providers are funding the gap on venture equity, debt, and capex pre-commitments against a future in which prices rise: OpenAI's reported 2025 losses ran between $5 and $13.5 billion against $3.7 to $4.3 billion of revenue, and Alphabet's announced capex steps from roughly $75 billion in 2025 to $175 to $185 billion in 2026.</w:t>
+      </w:r>
+      <w:r>
+        <w:rPr>
+          <w:color w:val="1E1D1C"/>
+          <w:vertAlign w:val="superscript"/>
+        </w:rPr>
+        <w:t>15</w:t>
+      </w:r>
+      <w:r>
+        <w:rPr>
+          <w:color w:val="1E1D1C"/>
+        </w:rPr>
+        <w:t xml:space="preserve"> </w:t>
+      </w:r>
+      <w:r>
+        <w:rPr>
+          <w:color w:val="1E1D1C"/>
+          <w:vertAlign w:val="superscript"/>
+        </w:rPr>
+        <w:t>16</w:t>
+      </w:r>
+      <w:r>
+        <w:rPr>
+          <w:color w:val="1E1D1C"/>
+        </w:rPr>
+        <w:t xml:space="preserve"> The practice has three defenses. First, the per-engagement token spend is small relative to the value of the weekly Game and the operating loop, so a meaningful price jump remains absorbable on most engagements. Second, the architecture is provider-neutral, so the practice can route work to whichever model holds the price-performance frontier at the time. Third, the Fractional AI Chief retainer is the structural place the cost rebalancing gets negotiated with the client each month, rather than landing as a surprise at renewal.</w:t>
+      </w:r>
+    </w:p>
+    <w:p>
+      <w:pPr>
         <w:pStyle w:val="Heading1"/>
         <w:spacing w:before="360" w:after="160"/>
       </w:pPr>
@@ -2416,6 +2545,43 @@
     <w:p>
       <w:pPr>
         <w:spacing w:after="120"/>
+      </w:pPr>
+      <w:r>
+        <w:rPr>
+          <w:color w:val="1E1D1C"/>
+        </w:rPr>
+        <w:t>There is also a clock on the input side. The inference costs that make these tools cheap to build today are subsidized below the unit economics of the underlying AI infrastructure buildout, and the major providers have publicly committed to capex programs that current token pricing cannot fund.</w:t>
+      </w:r>
+      <w:r>
+        <w:rPr>
+          <w:color w:val="1E1D1C"/>
+          <w:vertAlign w:val="superscript"/>
+        </w:rPr>
+        <w:t>15</w:t>
+      </w:r>
+      <w:r>
+        <w:rPr>
+          <w:color w:val="1E1D1C"/>
+        </w:rPr>
+        <w:t xml:space="preserve"> OpenAI posted between $5 and $13.5 billion of losses against $3.7 to $4.3 billion of revenue in 2025; Alphabet's announced 2026 capex steps from $75 billion to roughly $175 to $185 billion in a single year.</w:t>
+      </w:r>
+      <w:r>
+        <w:rPr>
+          <w:color w:val="1E1D1C"/>
+          <w:vertAlign w:val="superscript"/>
+        </w:rPr>
+        <w:t>16</w:t>
+      </w:r>
+      <w:r>
+        <w:rPr>
+          <w:color w:val="1E1D1C"/>
+        </w:rPr>
+        <w:t xml:space="preserve"> The window in which a small consultancy can build, ship, and price tools against current token economics is open now and will not stay open indefinitely; Step 1 is best executed inside it.</w:t>
+      </w:r>
+    </w:p>
+    <w:p>
+      <w:pPr>
+        <w:spacing w:after="120"/>
         <w:rPr>
           <w:rFonts w:hint="eastAsia"/>
         </w:rPr>
@@ -2793,6 +2959,71 @@
     </w:p>
     <w:p>
       <w:pPr>
+        <w:spacing w:after="80"/>
+        <w:ind w:left="360" w:hanging="360"/>
+      </w:pPr>
+      <w:r>
+        <w:rPr>
+          <w:color w:val="1E1D1C"/>
+          <w:sz w:val="20"/>
+        </w:rPr>
+        <w:t>12. HumaI Blog, "SaaSpocalypse: Why Enterprise Software Has Lost More Than $2 Trillion in 2026," accessed May 15, 2026, https://www.humai.blog/saaspocalypse-why-enterprise-software-has-lost-more-than-2-trillion-in-2026/.</w:t>
+      </w:r>
+    </w:p>
+    <w:p>
+      <w:pPr>
+        <w:spacing w:after="80"/>
+        <w:ind w:left="360" w:hanging="360"/>
+      </w:pPr>
+      <w:r>
+        <w:rPr>
+          <w:color w:val="1E1D1C"/>
+          <w:sz w:val="20"/>
+        </w:rPr>
+        <w:t>13. MindStudio, "SaaS Pricing Is Breaking: Why Per-Seat Models Don't Survive the AI Agent Era," accessed May 15, 2026, https://www.mindstudio.ai/blog/saas-pricing-ai-agent-era.</w:t>
+      </w:r>
+    </w:p>
+    <w:p>
+      <w:pPr>
+        <w:spacing w:after="80"/>
+        <w:ind w:left="360" w:hanging="360"/>
+      </w:pPr>
+      <w:r>
+        <w:rPr>
+          <w:color w:val="1E1D1C"/>
+          <w:sz w:val="20"/>
+        </w:rPr>
+        <w:t>14. Bain &amp; Company, "Per-Seat Software Pricing Isn't Dead, but New Models Are Gaining Steam," October 2025, https://www.bain.com/insights/per-seat-software-pricing-isnt-dead-but-new-models-are-gaining-steam/.</w:t>
+      </w:r>
+    </w:p>
+    <w:p>
+      <w:pPr>
+        <w:spacing w:after="80"/>
+        <w:ind w:left="360" w:hanging="360"/>
+      </w:pPr>
+      <w:r>
+        <w:rPr>
+          <w:color w:val="1E1D1C"/>
+          <w:sz w:val="20"/>
+        </w:rPr>
+        <w:t>15. Oplexa, "AI Inference Cost Crisis 2026: Why Your AI Bill Is Exploding," March 31, 2026, https://oplexa.com/ai-inference-cost-crisis-2026/; UpTech Studio, "The True Cost of AI: When the Subsidies Run Out," accessed May 15, 2026, https://www.uptechstudio.com/blog/the-true-cost-of-ai-when-the-subsidies-run-out.</w:t>
+      </w:r>
+    </w:p>
+    <w:p>
+      <w:pPr>
+        <w:spacing w:after="80"/>
+        <w:ind w:left="360" w:hanging="360"/>
+      </w:pPr>
+      <w:r>
+        <w:rPr>
+          <w:color w:val="1E1D1C"/>
+          <w:sz w:val="20"/>
+        </w:rPr>
+        <w:t>16. Artefact, "Is AI Really Getting Cheaper? The Token Cost Illusion," accessed May 15, 2026, https://www.artefact.com/blog/is-ai-really-getting-cheaper-the-token-cost-illusion/.</w:t>
+      </w:r>
+    </w:p>
+    <w:p>
+      <w:pPr>
         <w:pStyle w:val="Heading1"/>
         <w:pageBreakBefore/>
         <w:spacing w:before="360" w:after="160"/>
@@ -2845,34 +3076,26 @@
       <w:pPr>
         <w:spacing w:after="80"/>
         <w:ind w:left="360" w:hanging="360"/>
-        <w:rPr>
-          <w:rFonts w:hint="eastAsia"/>
-        </w:rPr>
-      </w:pPr>
-      <w:r>
-        <w:rPr>
-          <w:rFonts w:eastAsia="Open Sans" w:cs="Open Sans"/>
+      </w:pPr>
+      <w:r>
+        <w:rPr>
           <w:color w:val="1E1D1C"/>
           <w:sz w:val="20"/>
         </w:rPr>
-        <w:t>Blackstone, Hellman &amp; Friedman, Goldman Sachs, and Anthropic. "Anthropic Partners with Blackstone, Hellman &amp; Friedman, and Goldman Sachs to Launch Enterprise AI Services Firm." Joint press release, May 4, 2026. https://www.blackstone.com/news/press/anthropic-partners-with-blackstone-hellman-friedman-and-goldman-sachs-to-launch-enterprise-ai-services-firm/.</w:t>
+        <w:t>Artefact. "Is AI Really Getting Cheaper? The Token Cost Illusion." Accessed May 15, 2026. https://www.artefact.com/blog/is-ai-really-getting-cheaper-the-token-cost-illusion/.</w:t>
       </w:r>
     </w:p>
     <w:p>
       <w:pPr>
         <w:spacing w:after="80"/>
         <w:ind w:left="360" w:hanging="360"/>
-        <w:rPr>
-          <w:rFonts w:hint="eastAsia"/>
-        </w:rPr>
-      </w:pPr>
-      <w:r>
-        <w:rPr>
-          <w:rFonts w:eastAsia="Open Sans" w:cs="Open Sans"/>
+      </w:pPr>
+      <w:r>
+        <w:rPr>
           <w:color w:val="1E1D1C"/>
           <w:sz w:val="20"/>
         </w:rPr>
-        <w:t>Cognizant. "Cognizant Adopts Anthropic's Claude to Accelerate Enterprise AI Adoption at Scale and Deploys Claude to Drive Internal AI Transformation." News release, November 4, 2025. https://news.cognizant.com/2025-11-04-Cognizant-Adopts-Anthropics-Claude-to-Accelerate-Enterprise-AI-Adoption-at-Scale-and-Deploys-Claude-to-Drive-Internal-AI-Transformation.</w:t>
+        <w:t>Bain &amp; Company. "Per-Seat Software Pricing Isn't Dead, but New Models Are Gaining Steam." October 2025. https://www.bain.com/insights/per-seat-software-pricing-isnt-dead-but-new-models-are-gaining-steam/.</w:t>
       </w:r>
     </w:p>
     <w:p>
@@ -2889,7 +3112,7 @@
           <w:color w:val="1E1D1C"/>
           <w:sz w:val="20"/>
         </w:rPr>
-        <w:t>Data Consulting Insights. "AI Consulting Pricing: What GenAI Projects Actually Cost in 2026." Accessed May 14, 2026. https://dataconsultingfirms.com/insights/ai-consulting-pricing.</w:t>
+        <w:t>Blackstone, Hellman &amp; Friedman, Goldman Sachs, and Anthropic. "Anthropic Partners with Blackstone, Hellman &amp; Friedman, and Goldman Sachs to Launch Enterprise AI Services Firm." Joint press release, May 4, 2026. https://www.blackstone.com/news/press/anthropic-partners-with-blackstone-hellman-friedman-and-goldman-sachs-to-launch-enterprise-ai-services-firm/.</w:t>
       </w:r>
     </w:p>
     <w:p>
@@ -2906,7 +3129,7 @@
           <w:color w:val="1E1D1C"/>
           <w:sz w:val="20"/>
         </w:rPr>
-        <w:t>Ford, Brody, and Shirin Ghaffary. "OpenAI Acquires Tomoro to Boost Private Equity-Backed AI Venture." Bloomberg, May 11, 2026. https://www.bloomberg.com/news/articles/2026-05-11/openai-to-buy-consulting-firm-for-private-equity-joint-venture.</w:t>
+        <w:t>Cognizant. "Cognizant Adopts Anthropic's Claude to Accelerate Enterprise AI Adoption at Scale and Deploys Claude to Drive Internal AI Transformation." News release, November 4, 2025. https://news.cognizant.com/2025-11-04-Cognizant-Adopts-Anthropics-Claude-to-Accelerate-Enterprise-AI-Adoption-at-Scale-and-Deploys-Claude-to-Drive-Internal-AI-Transformation.</w:t>
       </w:r>
     </w:p>
     <w:p>
@@ -2923,7 +3146,7 @@
           <w:color w:val="1E1D1C"/>
           <w:sz w:val="20"/>
         </w:rPr>
-        <w:t>Garfinkle, Allie. "Anthropic Takes Shot at Consulting Industry in Joint Venture with Wall Street Giants." Fortune, May 4, 2026. https://fortune.com/2026/05/04/anthropic-claude-consulting-industry-joint-venture-blackstone-goldman-sachs/.</w:t>
+        <w:t>Data Consulting Insights. "AI Consulting Pricing: What GenAI Projects Actually Cost in 2026." Accessed May 14, 2026. https://dataconsultingfirms.com/insights/ai-consulting-pricing.</w:t>
       </w:r>
     </w:p>
     <w:p>
@@ -2940,7 +3163,7 @@
           <w:color w:val="1E1D1C"/>
           <w:sz w:val="20"/>
         </w:rPr>
-        <w:t>Google Cloud. "Google Cloud Commits $750 Million to Accelerate Partners' Agentic AI Development." Press release, April 22, 2026. https://www.googlecloudpresscorner.com/2026-04-22-Google-Cloud-Commits-750-Million-to-Accelerate-Partners-Agentic-AI-Development.</w:t>
+        <w:t>Ford, Brody, and Shirin Ghaffary. "OpenAI Acquires Tomoro to Boost Private Equity-Backed AI Venture." Bloomberg, May 11, 2026. https://www.bloomberg.com/news/articles/2026-05-11/openai-to-buy-consulting-firm-for-private-equity-joint-venture.</w:t>
       </w:r>
     </w:p>
     <w:p>
@@ -2957,7 +3180,7 @@
           <w:color w:val="1E1D1C"/>
           <w:sz w:val="20"/>
         </w:rPr>
-        <w:t>McKinsey &amp; Company. "McKinsey and Google Cloud Launch the McKinsey Google Transformation Group to Scale Enterprise Impact for the AI Era." New at McKinsey Blog, April 22, 2026. https://www.mckinsey.com/about-us/new-at-mckinsey-blog/mckinsey-and-google-cloud-launch-the-mckinsey-google-transformation-group-to-scale-enterprise-impact-for-the-ai-era.</w:t>
+        <w:t>Garfinkle, Allie. "Anthropic Takes Shot at Consulting Industry in Joint Venture with Wall Street Giants." Fortune, May 4, 2026. https://fortune.com/2026/05/04/anthropic-claude-consulting-industry-joint-venture-blackstone-goldman-sachs/.</w:t>
       </w:r>
     </w:p>
     <w:p>
@@ -2974,24 +3197,20 @@
           <w:color w:val="1E1D1C"/>
           <w:sz w:val="20"/>
         </w:rPr>
-        <w:t>OpenAI. "OpenAI Launches the OpenAI Deployment Company to Help Businesses Build Around Intelligence." May 12, 2026. https://openai.com/index/openai-launches-the-deployment-company/.</w:t>
+        <w:t>Google Cloud. "Google Cloud Commits $750 Million to Accelerate Partners' Agentic AI Development." Press release, April 22, 2026. https://www.googlecloudpresscorner.com/2026-04-22-Google-Cloud-Commits-750-Million-to-Accelerate-Partners-Agentic-AI-Development.</w:t>
       </w:r>
     </w:p>
     <w:p>
       <w:pPr>
         <w:spacing w:after="80"/>
         <w:ind w:left="360" w:hanging="360"/>
-        <w:rPr>
-          <w:rFonts w:hint="eastAsia"/>
-        </w:rPr>
-      </w:pPr>
-      <w:r>
-        <w:rPr>
-          <w:rFonts w:eastAsia="Open Sans" w:cs="Open Sans"/>
+      </w:pPr>
+      <w:r>
+        <w:rPr>
           <w:color w:val="1E1D1C"/>
           <w:sz w:val="20"/>
         </w:rPr>
-        <w:t>Pertama Partners. "AI Consultant Rates 2026: Market Data." Accessed May 14, 2026. https://www.pertamapartners.com/insights/ai-consultant-rates-2026.</w:t>
+        <w:t>HumaI Blog. "SaaSpocalypse: Why Enterprise Software Has Lost More Than $2 Trillion in 2026." Accessed May 15, 2026. https://www.humai.blog/saaspocalypse-why-enterprise-software-has-lost-more-than-2-trillion-in-2026/.</w:t>
       </w:r>
     </w:p>
     <w:p>
@@ -3008,6 +3227,83 @@
           <w:color w:val="1E1D1C"/>
           <w:sz w:val="20"/>
         </w:rPr>
+        <w:t>McKinsey &amp; Company. "McKinsey and Google Cloud Launch the McKinsey Google Transformation Group to Scale Enterprise Impact for the AI Era." New at McKinsey Blog, April 22, 2026. https://www.mckinsey.com/about-us/new-at-mckinsey-blog/mckinsey-and-google-cloud-launch-the-mckinsey-google-transformation-group-to-scale-enterprise-impact-for-the-ai-era.</w:t>
+      </w:r>
+    </w:p>
+    <w:p>
+      <w:pPr>
+        <w:spacing w:after="80"/>
+        <w:ind w:left="360" w:hanging="360"/>
+      </w:pPr>
+      <w:r>
+        <w:rPr>
+          <w:color w:val="1E1D1C"/>
+          <w:sz w:val="20"/>
+        </w:rPr>
+        <w:t>MindStudio. "SaaS Pricing Is Breaking: Why Per-Seat Models Don't Survive the AI Agent Era." Accessed May 15, 2026. https://www.mindstudio.ai/blog/saas-pricing-ai-agent-era.</w:t>
+      </w:r>
+    </w:p>
+    <w:p>
+      <w:pPr>
+        <w:spacing w:after="80"/>
+        <w:ind w:left="360" w:hanging="360"/>
+        <w:rPr>
+          <w:rFonts w:hint="eastAsia"/>
+        </w:rPr>
+      </w:pPr>
+      <w:r>
+        <w:rPr>
+          <w:rFonts w:eastAsia="Open Sans" w:cs="Open Sans"/>
+          <w:color w:val="1E1D1C"/>
+          <w:sz w:val="20"/>
+        </w:rPr>
+        <w:t>OpenAI. "OpenAI Launches the OpenAI Deployment Company to Help Businesses Build Around Intelligence." May 12, 2026. https://openai.com/index/openai-launches-the-deployment-company/.</w:t>
+      </w:r>
+    </w:p>
+    <w:p>
+      <w:pPr>
+        <w:spacing w:after="80"/>
+        <w:ind w:left="360" w:hanging="360"/>
+      </w:pPr>
+      <w:r>
+        <w:rPr>
+          <w:color w:val="1E1D1C"/>
+          <w:sz w:val="20"/>
+        </w:rPr>
+        <w:t>Oplexa. "AI Inference Cost Crisis 2026: Why Your AI Bill Is Exploding." March 31, 2026. https://oplexa.com/ai-inference-cost-crisis-2026/.</w:t>
+      </w:r>
+    </w:p>
+    <w:p>
+      <w:pPr>
+        <w:spacing w:after="80"/>
+        <w:ind w:left="360" w:hanging="360"/>
+        <w:rPr>
+          <w:rFonts w:hint="eastAsia"/>
+        </w:rPr>
+      </w:pPr>
+      <w:r>
+        <w:rPr>
+          <w:rFonts w:eastAsia="Open Sans" w:cs="Open Sans"/>
+          <w:color w:val="1E1D1C"/>
+          <w:sz w:val="20"/>
+        </w:rPr>
+        <w:t>Pertama Partners. "AI Consultant Rates 2026: Market Data." Accessed May 14, 2026. https://www.pertamapartners.com/insights/ai-consultant-rates-2026.</w:t>
+      </w:r>
+    </w:p>
+    <w:p>
+      <w:pPr>
+        <w:spacing w:after="80"/>
+        <w:ind w:left="360" w:hanging="360"/>
+        <w:rPr>
+          <w:rFonts w:hint="eastAsia"/>
+        </w:rPr>
+      </w:pPr>
+      <w:r>
+        <w:rPr>
+          <w:rFonts w:eastAsia="Open Sans" w:cs="Open Sans"/>
+          <w:color w:val="1E1D1C"/>
+          <w:sz w:val="20"/>
+        </w:rPr>
         <w:lastRenderedPageBreak/>
         <w:t>PwC. "2026 AI Business Predictions." Accessed May 14, 2026. https://www.pwc.com/us/en/tech-effect/ai-analytics/ai-predictions.html.</w:t>
       </w:r>
@@ -3044,6 +3340,19 @@
           <w:sz w:val="20"/>
         </w:rPr>
         <w:t>Small Business &amp; Entrepreneurship Council. "Success Strategies: The AI Tools Small Businesses Are Using." April 25, 2026. https://sbecouncil.org/2026/04/25/the-ai-tools-small-businesses-are-using/.</w:t>
+      </w:r>
+    </w:p>
+    <w:p>
+      <w:pPr>
+        <w:spacing w:after="80"/>
+        <w:ind w:left="360" w:hanging="360"/>
+      </w:pPr>
+      <w:r>
+        <w:rPr>
+          <w:color w:val="1E1D1C"/>
+          <w:sz w:val="20"/>
+        </w:rPr>
+        <w:t>UpTech Studio. "The True Cost of AI: When the Subsidies Run Out." Accessed May 15, 2026. https://www.uptechstudio.com/blog/the-true-cost-of-ai-when-the-subsidies-run-out.</w:t>
       </w:r>
     </w:p>
     <w:p>

</xml_diff>

<commit_message>
Re-skin pitch deck from teal to ISI logo blues; refresh whitepaper asset
Site:
- --teal      #7ebec5 → #0E76BC (lighter ISI logo blue)
- --teal-dark #4a8b91 → #0056A5 (darker ISI logo blue)
- --teal-soft #f0f8f9 → #EAF3FB (light blue wash)
- --teal-line #d9ecee → #CFE2F2 (light blue line)
- Hero + closer radial gradients moved to rgba(14,118,188,0.18)
- Variable names kept (--teal*) to limit blast radius; values only.

Whitepaper asset:
- ⅓ GDP claim attributed to NCMM Mid-Year 2025 Indicator (primary)
- 95% pilots claim attributed to MIT Project NANDA via Fortune
- $2T value pool stays on WEF
- Bibliography gains Fortune and National Center for the Middle Market

Co-Authored-By: Claude Opus 4.7 <noreply@anthropic.com>
</commit_message>
<xml_diff>
--- a/forward-deployed-decade/assets/Forward-Deployed-Decade.docx
+++ b/forward-deployed-decade/assets/Forward-Deployed-Decade.docx
@@ -625,14 +625,12 @@
       </w:pPr>
       <w:r>
         <w:rPr>
-          <w:rFonts w:eastAsia="Open Sans" w:cs="Open Sans"/>
-          <w:color w:val="1E1D1C"/>
-        </w:rPr>
-        <w:t>The World Economic Forum's 2026 mid-market analysis estimates that companies with $10 million to $1 billion in revenue represent one-third of private-sector GDP in developed economies and stand to capture at least $2 trillion of the global gen-AI value pool.</w:t>
-      </w:r>
-      <w:r>
-        <w:rPr>
-          <w:rFonts w:eastAsia="Open Sans" w:cs="Open Sans"/>
+          <w:color w:val="1E1D1C"/>
+        </w:rPr>
+        <w:t>Companies of $10 million to $1 billion in revenue represent about one-third of U.S. private-sector GDP, with parallel ratios across other developed economies, and the segment is estimated to capture at least $2 trillion of the global gen-AI value pool.</w:t>
+      </w:r>
+      <w:r>
+        <w:rPr>
           <w:color w:val="1E1D1C"/>
           <w:vertAlign w:val="superscript"/>
         </w:rPr>
@@ -640,14 +638,12 @@
       </w:r>
       <w:r>
         <w:rPr>
-          <w:rFonts w:eastAsia="Open Sans" w:cs="Open Sans"/>
-          <w:color w:val="1E1D1C"/>
-        </w:rPr>
-        <w:t xml:space="preserve"> The same body of WEF analysis flags the central friction: up to 95 percent of enterprise AI pilots fail to reach production.</w:t>
-      </w:r>
-      <w:r>
-        <w:rPr>
-          <w:rFonts w:eastAsia="Open Sans" w:cs="Open Sans"/>
+          <w:color w:val="1E1D1C"/>
+        </w:rPr>
+        <w:t xml:space="preserve"> The central friction is the production gap: roughly 95 percent of enterprise AI pilots fail to reach production.</w:t>
+      </w:r>
+      <w:r>
+        <w:rPr>
           <w:color w:val="1E1D1C"/>
           <w:vertAlign w:val="superscript"/>
         </w:rPr>
@@ -2862,20 +2858,10 @@
       </w:pPr>
       <w:r>
         <w:rPr>
-          <w:rFonts w:eastAsia="Open Sans" w:cs="Open Sans"/>
-          <w:b/>
           <w:color w:val="1E1D1C"/>
           <w:sz w:val="20"/>
         </w:rPr>
-        <w:t xml:space="preserve">8. </w:t>
-      </w:r>
-      <w:r>
-        <w:rPr>
-          <w:rFonts w:eastAsia="Open Sans" w:cs="Open Sans"/>
-          <w:color w:val="1E1D1C"/>
-          <w:sz w:val="20"/>
-        </w:rPr>
-        <w:t>World Economic Forum, "It's Time for AI's Mid-Market Business Moment. Here's Why," January 2026, https://www.weforum.org/stories/2026/01/ai-mid-market-business-growth/. The same body of WEF analysis reports the 95 percent AI-pilot failure rate.</w:t>
+        <w:t>8. The mid-market share of U.S. private-sector GDP is sourced to the National Center for the Middle Market, Mid-Year 2025 Middle Market Indicator (June 2025), https://www.middlemarketcenter.org/Media/Documents/MiddleMarketIndicators/2025-Q2/FullReport/NCMM_MMI_MID-YEAR_2025.pdf. The developed-economies framing and the $2 trillion gen-AI value-pool estimate are from the World Economic Forum, "It's Time for AI's Mid-Market Business Moment. Here's Why," January 2026, https://www.weforum.org/stories/2026/01/ai-mid-market-business-growth/. The 95 percent enterprise AI pilot failure rate is sourced to MIT Project NANDA, "The GenAI Divide: State of AI in Business 2025" (July 2025), as reported in Fortune, August 18, 2025, https://fortune.com/2025/08/18/mit-report-95-percent-generative-ai-pilots-at-companies-failing-cfo/.</w:t>
       </w:r>
     </w:p>
     <w:p>
@@ -3170,17 +3156,13 @@
       <w:pPr>
         <w:spacing w:after="80"/>
         <w:ind w:left="360" w:hanging="360"/>
-        <w:rPr>
-          <w:rFonts w:hint="eastAsia"/>
-        </w:rPr>
-      </w:pPr>
-      <w:r>
-        <w:rPr>
-          <w:rFonts w:eastAsia="Open Sans" w:cs="Open Sans"/>
+      </w:pPr>
+      <w:r>
+        <w:rPr>
           <w:color w:val="1E1D1C"/>
           <w:sz w:val="20"/>
         </w:rPr>
-        <w:t>Garfinkle, Allie. "Anthropic Takes Shot at Consulting Industry in Joint Venture with Wall Street Giants." Fortune, May 4, 2026. https://fortune.com/2026/05/04/anthropic-claude-consulting-industry-joint-venture-blackstone-goldman-sachs/.</w:t>
+        <w:t>Fortune. "MIT Report: 95% of Generative AI Pilots at Companies Are Failing." August 18, 2025. https://fortune.com/2025/08/18/mit-report-95-percent-generative-ai-pilots-at-companies-failing-cfo/.</w:t>
       </w:r>
     </w:p>
     <w:p>
@@ -3197,50 +3179,80 @@
           <w:color w:val="1E1D1C"/>
           <w:sz w:val="20"/>
         </w:rPr>
-        <w:t>Google Cloud. "Google Cloud Commits $750 Million to Accelerate Partners' Agentic AI Development." Press release, April 22, 2026. https://www.googlecloudpresscorner.com/2026-04-22-Google-Cloud-Commits-750-Million-to-Accelerate-Partners-Agentic-AI-Development.</w:t>
+        <w:t>Garfinkle, Allie. "Anthropic Takes Shot at Consulting Industry in Joint Venture with Wall Street Giants." Fortune, May 4, 2026. https://fortune.com/2026/05/04/anthropic-claude-consulting-industry-joint-venture-blackstone-goldman-sachs/.</w:t>
       </w:r>
     </w:p>
     <w:p>
       <w:pPr>
         <w:spacing w:after="80"/>
         <w:ind w:left="360" w:hanging="360"/>
-      </w:pPr>
-      <w:r>
-        <w:rPr>
+        <w:rPr>
+          <w:rFonts w:hint="eastAsia"/>
+        </w:rPr>
+      </w:pPr>
+      <w:r>
+        <w:rPr>
+          <w:rFonts w:eastAsia="Open Sans" w:cs="Open Sans"/>
           <w:color w:val="1E1D1C"/>
           <w:sz w:val="20"/>
         </w:rPr>
-        <w:t>HumaI Blog. "SaaSpocalypse: Why Enterprise Software Has Lost More Than $2 Trillion in 2026." Accessed May 15, 2026. https://www.humai.blog/saaspocalypse-why-enterprise-software-has-lost-more-than-2-trillion-in-2026/.</w:t>
+        <w:t>Google Cloud. "Google Cloud Commits $750 Million to Accelerate Partners' Agentic AI Development." Press release, April 22, 2026. https://www.googlecloudpresscorner.com/2026-04-22-Google-Cloud-Commits-750-Million-to-Accelerate-Partners-Agentic-AI-Development.</w:t>
       </w:r>
     </w:p>
     <w:p>
       <w:pPr>
         <w:spacing w:after="80"/>
         <w:ind w:left="360" w:hanging="360"/>
-        <w:rPr>
-          <w:rFonts w:hint="eastAsia"/>
-        </w:rPr>
-      </w:pPr>
-      <w:r>
-        <w:rPr>
-          <w:rFonts w:eastAsia="Open Sans" w:cs="Open Sans"/>
+      </w:pPr>
+      <w:r>
+        <w:rPr>
           <w:color w:val="1E1D1C"/>
           <w:sz w:val="20"/>
         </w:rPr>
-        <w:t>McKinsey &amp; Company. "McKinsey and Google Cloud Launch the McKinsey Google Transformation Group to Scale Enterprise Impact for the AI Era." New at McKinsey Blog, April 22, 2026. https://www.mckinsey.com/about-us/new-at-mckinsey-blog/mckinsey-and-google-cloud-launch-the-mckinsey-google-transformation-group-to-scale-enterprise-impact-for-the-ai-era.</w:t>
+        <w:t>HumaI Blog. "SaaSpocalypse: Why Enterprise Software Has Lost More Than $2 Trillion in 2026." Accessed May 15, 2026. https://www.humai.blog/saaspocalypse-why-enterprise-software-has-lost-more-than-2-trillion-in-2026/.</w:t>
       </w:r>
     </w:p>
     <w:p>
       <w:pPr>
         <w:spacing w:after="80"/>
         <w:ind w:left="360" w:hanging="360"/>
-      </w:pPr>
-      <w:r>
-        <w:rPr>
+        <w:rPr>
+          <w:rFonts w:hint="eastAsia"/>
+        </w:rPr>
+      </w:pPr>
+      <w:r>
+        <w:rPr>
+          <w:rFonts w:eastAsia="Open Sans" w:cs="Open Sans"/>
           <w:color w:val="1E1D1C"/>
           <w:sz w:val="20"/>
         </w:rPr>
+        <w:t>McKinsey &amp; Company. "McKinsey and Google Cloud Launch the McKinsey Google Transformation Group to Scale Enterprise Impact for the AI Era." New at McKinsey Blog, April 22, 2026. https://www.mckinsey.com/about-us/new-at-mckinsey-blog/mckinsey-and-google-cloud-launch-the-mckinsey-google-transformation-group-to-scale-enterprise-impact-for-the-ai-era.</w:t>
+      </w:r>
+    </w:p>
+    <w:p>
+      <w:pPr>
+        <w:spacing w:after="80"/>
+        <w:ind w:left="360" w:hanging="360"/>
+      </w:pPr>
+      <w:r>
+        <w:rPr>
+          <w:color w:val="1E1D1C"/>
+          <w:sz w:val="20"/>
+        </w:rPr>
         <w:t>MindStudio. "SaaS Pricing Is Breaking: Why Per-Seat Models Don't Survive the AI Agent Era." Accessed May 15, 2026. https://www.mindstudio.ai/blog/saas-pricing-ai-agent-era.</w:t>
+      </w:r>
+    </w:p>
+    <w:p>
+      <w:pPr>
+        <w:spacing w:after="80"/>
+        <w:ind w:left="360" w:hanging="360"/>
+      </w:pPr>
+      <w:r>
+        <w:rPr>
+          <w:color w:val="1E1D1C"/>
+          <w:sz w:val="20"/>
+        </w:rPr>
+        <w:t>National Center for the Middle Market. Mid-Year 2025 Middle Market Indicator. June 2025. https://www.middlemarketcenter.org/Media/Documents/MiddleMarketIndicators/2025-Q2/FullReport/NCMM_MMI_MID-YEAR_2025.pdf.</w:t>
       </w:r>
     </w:p>
     <w:p>

</xml_diff>

<commit_message>
Improve CTA contrast and re-skin docx accent colors to ISI blues
Site CTA:
- Resting state now uses the lighter blue (--teal #0E76BC) on white text
  for stronger visual pop in the nav; hover darkens to --teal-dark.
- Ghost variant gets an explicit border-color so it reads as a button.

Whitepaper docx:
- All teal accent (#7EBEC5) and teal-dark heading (#4A8B91) instances
  swapped to ISI logo blues (#0E76BC light, #0056A5 dark). 28 occurrences
  in document.xml.

Asset on site refreshed.

Co-Authored-By: Claude Opus 4.7 <noreply@anthropic.com>
</commit_message>
<xml_diff>
--- a/forward-deployed-decade/assets/Forward-Deployed-Decade.docx
+++ b/forward-deployed-decade/assets/Forward-Deployed-Decade.docx
@@ -61,7 +61,7 @@
         <w:rPr>
           <w:rFonts w:eastAsia="Open Sans" w:cs="Open Sans"/>
           <w:b/>
-          <w:color w:val="7EBEC5"/>
+          <w:color w:val="0E76BC"/>
           <w:sz w:val="28"/>
         </w:rPr>
         <w:t>――――――</w:t>
@@ -78,7 +78,7 @@
         <w:rPr>
           <w:rFonts w:eastAsia="Open Sans" w:cs="Open Sans"/>
           <w:b/>
-          <w:color w:val="4A8B91"/>
+          <w:color w:val="0056A5"/>
           <w:sz w:val="20"/>
         </w:rPr>
         <w:t>WHITE PAPER</w:t>
@@ -175,7 +175,7 @@
         <w:rPr>
           <w:rFonts w:eastAsia="Open Sans" w:cs="Open Sans"/>
           <w:b/>
-          <w:color w:val="4A8B91"/>
+          <w:color w:val="0056A5"/>
         </w:rPr>
         <w:t>Executive thesis.</w:t>
       </w:r>
@@ -257,7 +257,7 @@
       <w:r>
         <w:rPr>
           <w:rFonts w:ascii="Poppins" w:eastAsia="Poppins" w:hAnsi="Poppins" w:cs="Poppins"/>
-          <w:color w:val="4A8B91"/>
+          <w:color w:val="0056A5"/>
           <w:sz w:val="36"/>
         </w:rPr>
         <w:lastRenderedPageBreak/>
@@ -483,7 +483,7 @@
       <w:r>
         <w:rPr>
           <w:rFonts w:ascii="Poppins" w:eastAsia="Poppins" w:hAnsi="Poppins" w:cs="Poppins"/>
-          <w:color w:val="4A8B91"/>
+          <w:color w:val="0056A5"/>
           <w:sz w:val="36"/>
         </w:rPr>
         <w:t>2. Why this changes the consulting industry</w:t>
@@ -596,7 +596,7 @@
       <w:r>
         <w:rPr>
           <w:rFonts w:ascii="Poppins" w:eastAsia="Poppins" w:hAnsi="Poppins" w:cs="Poppins"/>
-          <w:color w:val="4A8B91"/>
+          <w:color w:val="0056A5"/>
           <w:sz w:val="36"/>
         </w:rPr>
         <w:lastRenderedPageBreak/>
@@ -828,7 +828,7 @@
       <w:r>
         <w:rPr>
           <w:rFonts w:ascii="Poppins" w:eastAsia="Poppins" w:hAnsi="Poppins" w:cs="Poppins"/>
-          <w:color w:val="4A8B91"/>
+          <w:color w:val="0056A5"/>
           <w:sz w:val="36"/>
         </w:rPr>
         <w:t>4. The Game: the foundational teaching tool</w:t>
@@ -1079,7 +1079,7 @@
       <w:r>
         <w:rPr>
           <w:rFonts w:ascii="Poppins" w:eastAsia="Poppins" w:hAnsi="Poppins" w:cs="Poppins"/>
-          <w:color w:val="4A8B91"/>
+          <w:color w:val="0056A5"/>
           <w:sz w:val="36"/>
         </w:rPr>
         <w:t>5. Why ISI is well-positioned</w:t>
@@ -1249,7 +1249,7 @@
       <w:r>
         <w:rPr>
           <w:rFonts w:ascii="Poppins" w:eastAsia="Poppins" w:hAnsi="Poppins" w:cs="Poppins"/>
-          <w:color w:val="4A8B91"/>
+          <w:color w:val="0056A5"/>
           <w:sz w:val="36"/>
         </w:rPr>
         <w:t>6. What the AI practice looks like inside ISI</w:t>
@@ -1485,7 +1485,7 @@
       <w:r>
         <w:rPr>
           <w:rFonts w:ascii="Poppins" w:eastAsia="Poppins" w:hAnsi="Poppins" w:cs="Poppins"/>
-          <w:color w:val="4A8B91"/>
+          <w:color w:val="0056A5"/>
           <w:sz w:val="36"/>
         </w:rPr>
         <w:lastRenderedPageBreak/>
@@ -1542,7 +1542,7 @@
               <w:rPr>
                 <w:rFonts w:ascii="Poppins" w:eastAsia="Poppins" w:hAnsi="Poppins" w:cs="Poppins"/>
                 <w:b/>
-                <w:color w:val="4A8B91"/>
+                <w:color w:val="0056A5"/>
               </w:rPr>
               <w:t>STRENGTHS</w:t>
             </w:r>
@@ -1559,7 +1559,7 @@
               <w:rPr>
                 <w:rFonts w:eastAsia="Open Sans" w:cs="Open Sans"/>
                 <w:b/>
-                <w:color w:val="4A8B91"/>
+                <w:color w:val="0056A5"/>
                 <w:sz w:val="18"/>
               </w:rPr>
               <w:t xml:space="preserve">• </w:t>
@@ -1585,7 +1585,7 @@
               <w:rPr>
                 <w:rFonts w:eastAsia="Open Sans" w:cs="Open Sans"/>
                 <w:b/>
-                <w:color w:val="4A8B91"/>
+                <w:color w:val="0056A5"/>
                 <w:sz w:val="18"/>
               </w:rPr>
               <w:t xml:space="preserve">• </w:t>
@@ -1611,7 +1611,7 @@
               <w:rPr>
                 <w:rFonts w:eastAsia="Open Sans" w:cs="Open Sans"/>
                 <w:b/>
-                <w:color w:val="4A8B91"/>
+                <w:color w:val="0056A5"/>
                 <w:sz w:val="18"/>
               </w:rPr>
               <w:t xml:space="preserve">• </w:t>
@@ -1637,7 +1637,7 @@
               <w:rPr>
                 <w:rFonts w:eastAsia="Open Sans" w:cs="Open Sans"/>
                 <w:b/>
-                <w:color w:val="4A8B91"/>
+                <w:color w:val="0056A5"/>
                 <w:sz w:val="18"/>
               </w:rPr>
               <w:t xml:space="preserve">• </w:t>
@@ -1663,7 +1663,7 @@
               <w:rPr>
                 <w:rFonts w:eastAsia="Open Sans" w:cs="Open Sans"/>
                 <w:b/>
-                <w:color w:val="4A8B91"/>
+                <w:color w:val="0056A5"/>
                 <w:sz w:val="18"/>
               </w:rPr>
               <w:t xml:space="preserve">• </w:t>
@@ -1689,7 +1689,7 @@
               <w:rPr>
                 <w:rFonts w:eastAsia="Open Sans" w:cs="Open Sans"/>
                 <w:b/>
-                <w:color w:val="4A8B91"/>
+                <w:color w:val="0056A5"/>
                 <w:sz w:val="18"/>
               </w:rPr>
               <w:t xml:space="preserve">• </w:t>
@@ -1887,7 +1887,7 @@
               <w:rPr>
                 <w:rFonts w:ascii="Poppins" w:eastAsia="Poppins" w:hAnsi="Poppins" w:cs="Poppins"/>
                 <w:b/>
-                <w:color w:val="4A8B91"/>
+                <w:color w:val="0056A5"/>
               </w:rPr>
               <w:t>OPPORTUNITIES</w:t>
             </w:r>
@@ -1904,7 +1904,7 @@
               <w:rPr>
                 <w:rFonts w:eastAsia="Open Sans" w:cs="Open Sans"/>
                 <w:b/>
-                <w:color w:val="4A8B91"/>
+                <w:color w:val="0056A5"/>
                 <w:sz w:val="18"/>
               </w:rPr>
               <w:t xml:space="preserve">• </w:t>
@@ -1930,7 +1930,7 @@
               <w:rPr>
                 <w:rFonts w:eastAsia="Open Sans" w:cs="Open Sans"/>
                 <w:b/>
-                <w:color w:val="4A8B91"/>
+                <w:color w:val="0056A5"/>
                 <w:sz w:val="18"/>
               </w:rPr>
               <w:t xml:space="preserve">• </w:t>
@@ -1956,7 +1956,7 @@
               <w:rPr>
                 <w:rFonts w:eastAsia="Open Sans" w:cs="Open Sans"/>
                 <w:b/>
-                <w:color w:val="4A8B91"/>
+                <w:color w:val="0056A5"/>
                 <w:sz w:val="18"/>
               </w:rPr>
               <w:t xml:space="preserve">• </w:t>
@@ -1982,7 +1982,7 @@
               <w:rPr>
                 <w:rFonts w:eastAsia="Open Sans" w:cs="Open Sans"/>
                 <w:b/>
-                <w:color w:val="4A8B91"/>
+                <w:color w:val="0056A5"/>
                 <w:sz w:val="18"/>
               </w:rPr>
               <w:t xml:space="preserve">• </w:t>
@@ -2008,7 +2008,7 @@
               <w:rPr>
                 <w:rFonts w:eastAsia="Open Sans" w:cs="Open Sans"/>
                 <w:b/>
-                <w:color w:val="4A8B91"/>
+                <w:color w:val="0056A5"/>
                 <w:sz w:val="18"/>
               </w:rPr>
               <w:lastRenderedPageBreak/>
@@ -2225,7 +2225,7 @@
       <w:r>
         <w:rPr>
           <w:rFonts w:ascii="Poppins" w:eastAsia="Poppins" w:hAnsi="Poppins" w:cs="Poppins"/>
-          <w:color w:val="4A8B91"/>
+          <w:color w:val="0056A5"/>
           <w:sz w:val="36"/>
         </w:rPr>
         <w:t>8. Risks and how the practice manages them</w:t>
@@ -2437,7 +2437,7 @@
       <w:r>
         <w:rPr>
           <w:rFonts w:ascii="Poppins" w:eastAsia="Poppins" w:hAnsi="Poppins" w:cs="Poppins"/>
-          <w:color w:val="4A8B91"/>
+          <w:color w:val="0056A5"/>
           <w:sz w:val="36"/>
         </w:rPr>
         <w:t>9. Recommendation</w:t>
@@ -2599,7 +2599,7 @@
       <w:r>
         <w:rPr>
           <w:rFonts w:ascii="Poppins" w:eastAsia="Poppins" w:hAnsi="Poppins" w:cs="Poppins"/>
-          <w:color w:val="4A8B91"/>
+          <w:color w:val="0056A5"/>
           <w:sz w:val="36"/>
         </w:rPr>
         <w:t>10. Closing</w:t>
@@ -2659,7 +2659,7 @@
       <w:r>
         <w:rPr>
           <w:rFonts w:ascii="Poppins" w:eastAsia="Poppins" w:hAnsi="Poppins" w:cs="Poppins"/>
-          <w:color w:val="4A8B91"/>
+          <w:color w:val="0056A5"/>
           <w:sz w:val="36"/>
         </w:rPr>
         <w:lastRenderedPageBreak/>
@@ -3017,7 +3017,7 @@
       <w:r>
         <w:rPr>
           <w:rFonts w:ascii="Poppins" w:eastAsia="Poppins" w:hAnsi="Poppins" w:cs="Poppins"/>
-          <w:color w:val="4A8B91"/>
+          <w:color w:val="0056A5"/>
           <w:sz w:val="36"/>
         </w:rPr>
         <w:lastRenderedPageBreak/>

</xml_diff>